<commit_message>
Update Bible study notes and resources for multiple languages for 2026-06-12 release
</commit_message>
<xml_diff>
--- a/eng/docx/29.content.docx
+++ b/eng/docx/29.content.docx
@@ -1091,7 +1091,7 @@
         <w:rPr>
           <w:lang w:val="en_US" w:bidi="en_US"/>
         </w:rPr>
-        <w:t>The locust plague was not just a natural event. It was a sign that the Day of the LORD was near. Starting with Amos in the 700s BC (</w:t>
+        <w:t>The locust plague was not just a natural event. It was a sign that the day of the Lord was near. Starting with Amos in the 700s BC (</w:t>
       </w:r>
       <w:hyperlink r:id="rId19">
         <w:r>
@@ -1701,7 +1701,7 @@
         <w:rPr>
           <w:lang w:val="en_US" w:bidi="en_US"/>
         </w:rPr>
-        <w:t>Some religious leaders taught the people of Jerusalem and Judah that the Day of the LORD would bring blessings for God's people. Echoing the prophet Zephaniah (</w:t>
+        <w:t>Some religious leaders taught the people of Jerusalem and Judah that the day of the Lord would bring blessings for God's people. Echoing the prophet Zephaniah (</w:t>
       </w:r>
       <w:hyperlink r:id="rId27">
         <w:r>
@@ -3943,7 +3943,7 @@
         <w:rPr>
           <w:lang w:val="en_US" w:bidi="en_US"/>
         </w:rPr>
-        <w:t>The prophet envisioned a future Day of the LORD. On this day, God would share his Spirit in new ways and show signs and wonders for everyone to witness. The apostle Peter said this prophecy came true on the day of Pentecost (</w:t>
+        <w:t>The prophet envisioned a future day of the Lord. On this day, God would share his Spirit in new ways and show signs and wonders for everyone to witness. The apostle Peter said this prophecy came true on the day of Pentecost (</w:t>
       </w:r>
       <w:hyperlink r:id="rId64">
         <w:r>

</xml_diff>